<commit_message>
Update documentation: new UI design, seed data, container deployment docs
- New .md docs: diseno_ui.md, seed_data.md, despliegue_contenedores.md
- New .docx generated from all updated .md via Pandoc (5 files)
- New PlantUML diagrams: diagrama_seed_data.puml, diagrama_ui_componentes.puml
- Updated existing diagrams: c2_contenedores, diagrama_nodos, mapa_navegacion
- All 19 diagrams re-rendered to PNG (14 modelos + 5 uml)
- Updated docs/modelos/README.md to reference all new docs
</commit_message>
<xml_diff>
--- a/README.docx
+++ b/README.docx
@@ -2,7 +2,7 @@
 <file path=word/document.xml><?xml version="1.0" encoding="utf-8"?>
 <w:document xmlns:w="http://schemas.openxmlformats.org/wordprocessingml/2006/main" xmlns:m="http://schemas.openxmlformats.org/officeDocument/2006/math" xmlns:r="http://schemas.openxmlformats.org/officeDocument/2006/relationships" xmlns:o="urn:schemas-microsoft-com:office:office" xmlns:v="urn:schemas-microsoft-com:vml" xmlns:w10="urn:schemas-microsoft-com:office:word" xmlns:a="http://schemas.openxmlformats.org/drawingml/2006/main" xmlns:pic="http://schemas.openxmlformats.org/drawingml/2006/picture" xmlns:wp="http://schemas.openxmlformats.org/drawingml/2006/wordprocessingDrawing">
   <w:body>
-    <w:bookmarkStart w:id="29" w:name="proyectodjviernes---sistema-crm"/>
+    <w:bookmarkStart w:id="39" w:name="proyectodjviernes---sistema-crm"/>
     <w:p>
       <w:pPr>
         <w:pStyle w:val="Heading1"/>
@@ -19,274 +19,13 @@
         <w:t xml:space="preserve">Sistema de gestión de clientes (CRM) desarrollado en Django con arquitectura modular, POO, principios SOLID y 4 capas de seguridad.</w:t>
       </w:r>
     </w:p>
-    <w:bookmarkStart w:id="9" w:name="módulos"/>
+    <w:bookmarkStart w:id="9" w:name="stack-tecnológico"/>
     <w:p>
       <w:pPr>
         <w:pStyle w:val="Heading2"/>
       </w:pPr>
       <w:r>
-        <w:t xml:space="preserve">Módulos</w:t>
-      </w:r>
-    </w:p>
-    <w:p>
-      <w:pPr>
-        <w:pStyle w:val="Compact"/>
-        <w:numPr>
-          <w:ilvl w:val="0"/>
-          <w:numId w:val="1001"/>
-        </w:numPr>
-      </w:pPr>
-      <w:r>
-        <w:rPr>
-          <w:b/>
-          <w:bCs/>
-        </w:rPr>
-        <w:t xml:space="preserve">website</w:t>
-      </w:r>
-      <w:r>
-        <w:t xml:space="preserve">: CRUD principal de clientes (Record)</w:t>
-      </w:r>
-    </w:p>
-    <w:p>
-      <w:pPr>
-        <w:pStyle w:val="Compact"/>
-        <w:numPr>
-          <w:ilvl w:val="0"/>
-          <w:numId w:val="1001"/>
-        </w:numPr>
-      </w:pPr>
-      <w:r>
-        <w:rPr>
-          <w:b/>
-          <w:bCs/>
-        </w:rPr>
-        <w:t xml:space="preserve">usuarios</w:t>
-      </w:r>
-      <w:r>
-        <w:t xml:space="preserve">: Gestión de usuarios con roles (Cliente, Vendedor, Gestor, Admin)</w:t>
-      </w:r>
-    </w:p>
-    <w:p>
-      <w:pPr>
-        <w:pStyle w:val="Compact"/>
-        <w:numPr>
-          <w:ilvl w:val="0"/>
-          <w:numId w:val="1001"/>
-        </w:numPr>
-      </w:pPr>
-      <w:r>
-        <w:rPr>
-          <w:b/>
-          <w:bCs/>
-        </w:rPr>
-        <w:t xml:space="preserve">productos</w:t>
-      </w:r>
-      <w:r>
-        <w:t xml:space="preserve">: CRUD de productos</w:t>
-      </w:r>
-    </w:p>
-    <w:p>
-      <w:pPr>
-        <w:pStyle w:val="Compact"/>
-        <w:numPr>
-          <w:ilvl w:val="0"/>
-          <w:numId w:val="1001"/>
-        </w:numPr>
-      </w:pPr>
-      <w:r>
-        <w:rPr>
-          <w:b/>
-          <w:bCs/>
-        </w:rPr>
-        <w:t xml:space="preserve">catalogo</w:t>
-      </w:r>
-      <w:r>
-        <w:t xml:space="preserve">: Categorías y catálogos de productos</w:t>
-      </w:r>
-    </w:p>
-    <w:p>
-      <w:pPr>
-        <w:pStyle w:val="Compact"/>
-        <w:numPr>
-          <w:ilvl w:val="0"/>
-          <w:numId w:val="1001"/>
-        </w:numPr>
-      </w:pPr>
-      <w:r>
-        <w:rPr>
-          <w:b/>
-          <w:bCs/>
-        </w:rPr>
-        <w:t xml:space="preserve">core</w:t>
-      </w:r>
-      <w:r>
-        <w:t xml:space="preserve">: Capa base con servicios, repositorios, validadores y seguridad</w:t>
-      </w:r>
-    </w:p>
-    <w:bookmarkEnd w:id="9"/>
-    <w:bookmarkStart w:id="10" w:name="requisitos"/>
-    <w:p>
-      <w:pPr>
-        <w:pStyle w:val="Heading2"/>
-      </w:pPr>
-      <w:r>
-        <w:t xml:space="preserve">Requisitos</w:t>
-      </w:r>
-    </w:p>
-    <w:p>
-      <w:pPr>
-        <w:pStyle w:val="FirstParagraph"/>
-      </w:pPr>
-      <w:r>
-        <w:t xml:space="preserve">Ver</w:t>
-      </w:r>
-      <w:r>
-        <w:t xml:space="preserve"> </w:t>
-      </w:r>
-      <w:r>
-        <w:rPr>
-          <w:rStyle w:val="VerbatimChar"/>
-        </w:rPr>
-        <w:t xml:space="preserve">requirements.txt</w:t>
-      </w:r>
-      <w:r>
-        <w:t xml:space="preserve">.</w:t>
-      </w:r>
-    </w:p>
-    <w:bookmarkEnd w:id="10"/>
-    <w:bookmarkStart w:id="11" w:name="instalación"/>
-    <w:p>
-      <w:pPr>
-        <w:pStyle w:val="Heading2"/>
-      </w:pPr>
-      <w:r>
-        <w:t xml:space="preserve">Instalación</w:t>
-      </w:r>
-    </w:p>
-    <w:p>
-      <w:pPr>
-        <w:pStyle w:val="SourceCode"/>
-      </w:pPr>
-      <w:r>
-        <w:rPr>
-          <w:rStyle w:val="ExtensionTok"/>
-        </w:rPr>
-        <w:t xml:space="preserve">python</w:t>
-      </w:r>
-      <w:r>
-        <w:rPr>
-          <w:rStyle w:val="NormalTok"/>
-        </w:rPr>
-        <w:t xml:space="preserve"> </w:t>
-      </w:r>
-      <w:r>
-        <w:rPr>
-          <w:rStyle w:val="AttributeTok"/>
-        </w:rPr>
-        <w:t xml:space="preserve">-m</w:t>
-      </w:r>
-      <w:r>
-        <w:rPr>
-          <w:rStyle w:val="NormalTok"/>
-        </w:rPr>
-        <w:t xml:space="preserve"> venv entorno</w:t>
-      </w:r>
-      <w:r>
-        <w:br/>
-      </w:r>
-      <w:r>
-        <w:rPr>
-          <w:rStyle w:val="BuiltInTok"/>
-        </w:rPr>
-        <w:t xml:space="preserve">source</w:t>
-      </w:r>
-      <w:r>
-        <w:rPr>
-          <w:rStyle w:val="NormalTok"/>
-        </w:rPr>
-        <w:t xml:space="preserve"> entorno/bin/activate</w:t>
-      </w:r>
-      <w:r>
-        <w:br/>
-      </w:r>
-      <w:r>
-        <w:rPr>
-          <w:rStyle w:val="ExtensionTok"/>
-        </w:rPr>
-        <w:t xml:space="preserve">pip</w:t>
-      </w:r>
-      <w:r>
-        <w:rPr>
-          <w:rStyle w:val="NormalTok"/>
-        </w:rPr>
-        <w:t xml:space="preserve"> install </w:t>
-      </w:r>
-      <w:r>
-        <w:rPr>
-          <w:rStyle w:val="AttributeTok"/>
-        </w:rPr>
-        <w:t xml:space="preserve">-r</w:t>
-      </w:r>
-      <w:r>
-        <w:rPr>
-          <w:rStyle w:val="NormalTok"/>
-        </w:rPr>
-        <w:t xml:space="preserve"> requirements.txt</w:t>
-      </w:r>
-      <w:r>
-        <w:br/>
-      </w:r>
-      <w:r>
-        <w:rPr>
-          <w:rStyle w:val="BuiltInTok"/>
-        </w:rPr>
-        <w:t xml:space="preserve">cd</w:t>
-      </w:r>
-      <w:r>
-        <w:rPr>
-          <w:rStyle w:val="NormalTok"/>
-        </w:rPr>
-        <w:t xml:space="preserve"> dcrm</w:t>
-      </w:r>
-      <w:r>
-        <w:br/>
-      </w:r>
-      <w:r>
-        <w:rPr>
-          <w:rStyle w:val="ExtensionTok"/>
-        </w:rPr>
-        <w:t xml:space="preserve">python</w:t>
-      </w:r>
-      <w:r>
-        <w:rPr>
-          <w:rStyle w:val="NormalTok"/>
-        </w:rPr>
-        <w:t xml:space="preserve"> manage.py migrate</w:t>
-      </w:r>
-      <w:r>
-        <w:br/>
-      </w:r>
-      <w:r>
-        <w:rPr>
-          <w:rStyle w:val="ExtensionTok"/>
-        </w:rPr>
-        <w:t xml:space="preserve">python</w:t>
-      </w:r>
-      <w:r>
-        <w:rPr>
-          <w:rStyle w:val="NormalTok"/>
-        </w:rPr>
-        <w:t xml:space="preserve"> manage.py runserver</w:t>
-      </w:r>
-    </w:p>
-    <w:bookmarkEnd w:id="11"/>
-    <w:bookmarkStart w:id="12" w:name="roles"/>
-    <w:p>
-      <w:pPr>
-        <w:pStyle w:val="Heading2"/>
-      </w:pPr>
-      <w:r>
-        <w:t xml:space="preserve">Roles</w:t>
+        <w:t xml:space="preserve">Stack Tecnológico</w:t>
       </w:r>
     </w:p>
     <w:tbl>
@@ -296,8 +35,9 @@
         <w:tblLook w:firstRow="1" w:lastRow="0" w:firstColumn="0" w:lastColumn="0" w:noHBand="0" w:noVBand="0" w:val="0020"/>
       </w:tblPr>
       <w:tblGrid>
-        <w:gridCol w:w="3960"/>
-        <w:gridCol w:w="3960"/>
+        <w:gridCol w:w="2640"/>
+        <w:gridCol w:w="2640"/>
+        <w:gridCol w:w="2640"/>
       </w:tblGrid>
       <w:tr>
         <w:trPr>
@@ -310,18 +50,29 @@
               <w:pStyle w:val="Compact"/>
             </w:pPr>
             <w:r>
-              <w:t xml:space="preserve">Rol</w:t>
-            </w:r>
-          </w:p>
-        </w:tc>
-        <w:tc>
-          <w:tcPr/>
-          <w:p>
-            <w:pPr>
-              <w:pStyle w:val="Compact"/>
-            </w:pPr>
-            <w:r>
-              <w:t xml:space="preserve">Descripción</w:t>
+              <w:t xml:space="preserve">Tecnología</w:t>
+            </w:r>
+          </w:p>
+        </w:tc>
+        <w:tc>
+          <w:tcPr/>
+          <w:p>
+            <w:pPr>
+              <w:pStyle w:val="Compact"/>
+            </w:pPr>
+            <w:r>
+              <w:t xml:space="preserve">Versión</w:t>
+            </w:r>
+          </w:p>
+        </w:tc>
+        <w:tc>
+          <w:tcPr/>
+          <w:p>
+            <w:pPr>
+              <w:pStyle w:val="Compact"/>
+            </w:pPr>
+            <w:r>
+              <w:t xml:space="preserve">Uso</w:t>
             </w:r>
           </w:p>
         </w:tc>
@@ -334,18 +85,29 @@
               <w:pStyle w:val="Compact"/>
             </w:pPr>
             <w:r>
-              <w:t xml:space="preserve">Cliente</w:t>
-            </w:r>
-          </w:p>
-        </w:tc>
-        <w:tc>
-          <w:tcPr/>
-          <w:p>
-            <w:pPr>
-              <w:pStyle w:val="Compact"/>
-            </w:pPr>
-            <w:r>
-              <w:t xml:space="preserve">Acceso básico de lectura</w:t>
+              <w:t xml:space="preserve">Django</w:t>
+            </w:r>
+          </w:p>
+        </w:tc>
+        <w:tc>
+          <w:tcPr/>
+          <w:p>
+            <w:pPr>
+              <w:pStyle w:val="Compact"/>
+            </w:pPr>
+            <w:r>
+              <w:t xml:space="preserve">6.0.6</w:t>
+            </w:r>
+          </w:p>
+        </w:tc>
+        <w:tc>
+          <w:tcPr/>
+          <w:p>
+            <w:pPr>
+              <w:pStyle w:val="Compact"/>
+            </w:pPr>
+            <w:r>
+              <w:t xml:space="preserve">Framework web</w:t>
             </w:r>
           </w:p>
         </w:tc>
@@ -358,18 +120,29 @@
               <w:pStyle w:val="Compact"/>
             </w:pPr>
             <w:r>
-              <w:t xml:space="preserve">Vendedor</w:t>
-            </w:r>
-          </w:p>
-        </w:tc>
-        <w:tc>
-          <w:tcPr/>
-          <w:p>
-            <w:pPr>
-              <w:pStyle w:val="Compact"/>
-            </w:pPr>
-            <w:r>
-              <w:t xml:space="preserve">Gestión de clientes y productos</w:t>
+              <w:t xml:space="preserve">Bootstrap 5</w:t>
+            </w:r>
+          </w:p>
+        </w:tc>
+        <w:tc>
+          <w:tcPr/>
+          <w:p>
+            <w:pPr>
+              <w:pStyle w:val="Compact"/>
+            </w:pPr>
+            <w:r>
+              <w:t xml:space="preserve">5.3.x</w:t>
+            </w:r>
+          </w:p>
+        </w:tc>
+        <w:tc>
+          <w:tcPr/>
+          <w:p>
+            <w:pPr>
+              <w:pStyle w:val="Compact"/>
+            </w:pPr>
+            <w:r>
+              <w:t xml:space="preserve">UI components (local)</w:t>
             </w:r>
           </w:p>
         </w:tc>
@@ -382,18 +155,29 @@
               <w:pStyle w:val="Compact"/>
             </w:pPr>
             <w:r>
-              <w:t xml:space="preserve">Gestor</w:t>
-            </w:r>
-          </w:p>
-        </w:tc>
-        <w:tc>
-          <w:tcPr/>
-          <w:p>
-            <w:pPr>
-              <w:pStyle w:val="Compact"/>
-            </w:pPr>
-            <w:r>
-              <w:t xml:space="preserve">Administración de catálogos</w:t>
+              <w:t xml:space="preserve">Bootstrap Icons</w:t>
+            </w:r>
+          </w:p>
+        </w:tc>
+        <w:tc>
+          <w:tcPr/>
+          <w:p>
+            <w:pPr>
+              <w:pStyle w:val="Compact"/>
+            </w:pPr>
+            <w:r>
+              <w:t xml:space="preserve">1.11.3</w:t>
+            </w:r>
+          </w:p>
+        </w:tc>
+        <w:tc>
+          <w:tcPr/>
+          <w:p>
+            <w:pPr>
+              <w:pStyle w:val="Compact"/>
+            </w:pPr>
+            <w:r>
+              <w:t xml:space="preserve">Iconografía (local)</w:t>
             </w:r>
           </w:p>
         </w:tc>
@@ -406,31 +190,282 @@
               <w:pStyle w:val="Compact"/>
             </w:pPr>
             <w:r>
-              <w:t xml:space="preserve">Admin</w:t>
-            </w:r>
-          </w:p>
-        </w:tc>
-        <w:tc>
-          <w:tcPr/>
-          <w:p>
-            <w:pPr>
-              <w:pStyle w:val="Compact"/>
-            </w:pPr>
-            <w:r>
-              <w:t xml:space="preserve">Acceso completo + panel Django</w:t>
+              <w:t xml:space="preserve">SQLite</w:t>
+            </w:r>
+          </w:p>
+        </w:tc>
+        <w:tc>
+          <w:tcPr/>
+          <w:p>
+            <w:pPr>
+              <w:pStyle w:val="Compact"/>
+            </w:pPr>
+            <w:r>
+              <w:t xml:space="preserve">-</w:t>
+            </w:r>
+          </w:p>
+        </w:tc>
+        <w:tc>
+          <w:tcPr/>
+          <w:p>
+            <w:pPr>
+              <w:pStyle w:val="Compact"/>
+            </w:pPr>
+            <w:r>
+              <w:t xml:space="preserve">Base de datos</w:t>
+            </w:r>
+          </w:p>
+        </w:tc>
+      </w:tr>
+      <w:tr>
+        <w:tc>
+          <w:tcPr/>
+          <w:p>
+            <w:pPr>
+              <w:pStyle w:val="Compact"/>
+            </w:pPr>
+            <w:r>
+              <w:t xml:space="preserve">Gunicorn</w:t>
+            </w:r>
+          </w:p>
+        </w:tc>
+        <w:tc>
+          <w:tcPr/>
+          <w:p>
+            <w:pPr>
+              <w:pStyle w:val="Compact"/>
+            </w:pPr>
+            <w:r>
+              <w:t xml:space="preserve">26.0.0</w:t>
+            </w:r>
+          </w:p>
+        </w:tc>
+        <w:tc>
+          <w:tcPr/>
+          <w:p>
+            <w:pPr>
+              <w:pStyle w:val="Compact"/>
+            </w:pPr>
+            <w:r>
+              <w:t xml:space="preserve">Servidor producción</w:t>
+            </w:r>
+          </w:p>
+        </w:tc>
+      </w:tr>
+      <w:tr>
+        <w:tc>
+          <w:tcPr/>
+          <w:p>
+            <w:pPr>
+              <w:pStyle w:val="Compact"/>
+            </w:pPr>
+            <w:r>
+              <w:t xml:space="preserve">Python</w:t>
+            </w:r>
+          </w:p>
+        </w:tc>
+        <w:tc>
+          <w:tcPr/>
+          <w:p>
+            <w:pPr>
+              <w:pStyle w:val="Compact"/>
+            </w:pPr>
+            <w:r>
+              <w:t xml:space="preserve">3.12+</w:t>
+            </w:r>
+          </w:p>
+        </w:tc>
+        <w:tc>
+          <w:tcPr/>
+          <w:p>
+            <w:pPr>
+              <w:pStyle w:val="Compact"/>
+            </w:pPr>
+            <w:r>
+              <w:t xml:space="preserve">Lenguaje</w:t>
             </w:r>
           </w:p>
         </w:tc>
       </w:tr>
     </w:tbl>
-    <w:bookmarkEnd w:id="12"/>
-    <w:bookmarkStart w:id="13" w:name="seguridad-4-capas"/>
+    <w:bookmarkEnd w:id="9"/>
+    <w:bookmarkStart w:id="10" w:name="diseño-ui-moderno"/>
     <w:p>
       <w:pPr>
         <w:pStyle w:val="Heading2"/>
       </w:pPr>
       <w:r>
-        <w:t xml:space="preserve">Seguridad (4 Capas)</w:t>
+        <w:t xml:space="preserve">Diseño UI Moderno</w:t>
+      </w:r>
+    </w:p>
+    <w:p>
+      <w:pPr>
+        <w:pStyle w:val="FirstParagraph"/>
+      </w:pPr>
+      <w:r>
+        <w:t xml:space="preserve">El sistema cuenta con un diseño propio distintivo (apartado del tema original del instructor):</w:t>
+      </w:r>
+    </w:p>
+    <w:p>
+      <w:pPr>
+        <w:pStyle w:val="Compact"/>
+        <w:numPr>
+          <w:ilvl w:val="0"/>
+          <w:numId w:val="1001"/>
+        </w:numPr>
+      </w:pPr>
+      <w:r>
+        <w:rPr>
+          <w:b/>
+          <w:bCs/>
+        </w:rPr>
+        <w:t xml:space="preserve">Paleta de colores</w:t>
+      </w:r>
+      <w:r>
+        <w:t xml:space="preserve">: Índigo primario (#4F46E5), sky secundario (#0EA5E9), ámbar acento (#F59E0B)</w:t>
+      </w:r>
+    </w:p>
+    <w:p>
+      <w:pPr>
+        <w:pStyle w:val="Compact"/>
+        <w:numPr>
+          <w:ilvl w:val="0"/>
+          <w:numId w:val="1001"/>
+        </w:numPr>
+      </w:pPr>
+      <w:r>
+        <w:rPr>
+          <w:b/>
+          <w:bCs/>
+        </w:rPr>
+        <w:t xml:space="preserve">Sidebar degradado</w:t>
+      </w:r>
+      <w:r>
+        <w:t xml:space="preserve">: Gradiente púrpura oscuro (#1E1B4B → #312E81)</w:t>
+      </w:r>
+    </w:p>
+    <w:p>
+      <w:pPr>
+        <w:pStyle w:val="Compact"/>
+        <w:numPr>
+          <w:ilvl w:val="0"/>
+          <w:numId w:val="1001"/>
+        </w:numPr>
+      </w:pPr>
+      <w:r>
+        <w:rPr>
+          <w:b/>
+          <w:bCs/>
+        </w:rPr>
+        <w:t xml:space="preserve">Dashboard Bento-Grid</w:t>
+      </w:r>
+      <w:r>
+        <w:t xml:space="preserve">: Layout de tarjetas tipo bento-grid con estadísticas, actividad reciente y accesos rápidos</w:t>
+      </w:r>
+    </w:p>
+    <w:p>
+      <w:pPr>
+        <w:pStyle w:val="Compact"/>
+        <w:numPr>
+          <w:ilvl w:val="0"/>
+          <w:numId w:val="1001"/>
+        </w:numPr>
+      </w:pPr>
+      <w:r>
+        <w:rPr>
+          <w:b/>
+          <w:bCs/>
+        </w:rPr>
+        <w:t xml:space="preserve">Glassmorfismo</w:t>
+      </w:r>
+      <w:r>
+        <w:t xml:space="preserve">: Efecto de vidrio esmerilado en navbar y tarjetas</w:t>
+      </w:r>
+    </w:p>
+    <w:p>
+      <w:pPr>
+        <w:pStyle w:val="Compact"/>
+        <w:numPr>
+          <w:ilvl w:val="0"/>
+          <w:numId w:val="1001"/>
+        </w:numPr>
+      </w:pPr>
+      <w:r>
+        <w:rPr>
+          <w:b/>
+          <w:bCs/>
+        </w:rPr>
+        <w:t xml:space="preserve">Animaciones</w:t>
+      </w:r>
+      <w:r>
+        <w:t xml:space="preserve">: Fade-in, slide-in, stagger en elementos del dashboard</w:t>
+      </w:r>
+    </w:p>
+    <w:p>
+      <w:pPr>
+        <w:pStyle w:val="Compact"/>
+        <w:numPr>
+          <w:ilvl w:val="0"/>
+          <w:numId w:val="1001"/>
+        </w:numPr>
+      </w:pPr>
+      <w:r>
+        <w:rPr>
+          <w:b/>
+          <w:bCs/>
+        </w:rPr>
+        <w:t xml:space="preserve">Responsive</w:t>
+      </w:r>
+      <w:r>
+        <w:t xml:space="preserve">: Offcanvas sidebar en móviles, layout adaptativo</w:t>
+      </w:r>
+    </w:p>
+    <w:p>
+      <w:pPr>
+        <w:pStyle w:val="Compact"/>
+        <w:numPr>
+          <w:ilvl w:val="0"/>
+          <w:numId w:val="1001"/>
+        </w:numPr>
+      </w:pPr>
+      <w:r>
+        <w:rPr>
+          <w:b/>
+          <w:bCs/>
+        </w:rPr>
+        <w:t xml:space="preserve">Login</w:t>
+      </w:r>
+      <w:r>
+        <w:t xml:space="preserve">: Tarjeta centrada con fondo degradado (reemplaza el split original del instructor)</w:t>
+      </w:r>
+    </w:p>
+    <w:p>
+      <w:pPr>
+        <w:pStyle w:val="Compact"/>
+        <w:numPr>
+          <w:ilvl w:val="0"/>
+          <w:numId w:val="1001"/>
+        </w:numPr>
+      </w:pPr>
+      <w:r>
+        <w:rPr>
+          <w:b/>
+          <w:bCs/>
+        </w:rPr>
+        <w:t xml:space="preserve">Recursos 100% locales</w:t>
+      </w:r>
+      <w:r>
+        <w:t xml:space="preserve">: Bootstrap CSS/JS e iconos servidos internamente sin CDNs</w:t>
+      </w:r>
+    </w:p>
+    <w:bookmarkEnd w:id="10"/>
+    <w:bookmarkStart w:id="11" w:name="módulos"/>
+    <w:p>
+      <w:pPr>
+        <w:pStyle w:val="Heading2"/>
+      </w:pPr>
+      <w:r>
+        <w:t xml:space="preserve">Módulos</w:t>
       </w:r>
     </w:p>
     <w:p>
@@ -446,22 +481,10 @@
           <w:b/>
           <w:bCs/>
         </w:rPr>
-        <w:t xml:space="preserve">Autenticación y Autorización</w:t>
-      </w:r>
-      <w:r>
-        <w:t xml:space="preserve">:</w:t>
-      </w:r>
-      <w:r>
-        <w:t xml:space="preserve"> </w:t>
-      </w:r>
-      <w:r>
-        <w:rPr>
-          <w:rStyle w:val="VerbatimChar"/>
-        </w:rPr>
-        <w:t xml:space="preserve">@login_required</w:t>
-      </w:r>
-      <w:r>
-        <w:t xml:space="preserve">, roles por perfil</w:t>
+        <w:t xml:space="preserve">website</w:t>
+      </w:r>
+      <w:r>
+        <w:t xml:space="preserve">: CRUD principal de clientes (Record) con tabla de datos y paginación</w:t>
       </w:r>
     </w:p>
     <w:p>
@@ -477,10 +500,10 @@
           <w:b/>
           <w:bCs/>
         </w:rPr>
-        <w:t xml:space="preserve">CSRF</w:t>
-      </w:r>
-      <w:r>
-        <w:t xml:space="preserve">: Tokens en todos los formularios</w:t>
+        <w:t xml:space="preserve">usuarios</w:t>
+      </w:r>
+      <w:r>
+        <w:t xml:space="preserve">: Gestión de usuarios con roles (Cliente, Vendedor, Gestor, Admin) y perfiles</w:t>
       </w:r>
     </w:p>
     <w:p>
@@ -496,10 +519,10 @@
           <w:b/>
           <w:bCs/>
         </w:rPr>
-        <w:t xml:space="preserve">Validación de Entrada</w:t>
-      </w:r>
-      <w:r>
-        <w:t xml:space="preserve">: Django Forms + RegexValidator</w:t>
+        <w:t xml:space="preserve">productos</w:t>
+      </w:r>
+      <w:r>
+        <w:t xml:space="preserve">: CRUD de productos con stock y precios</w:t>
       </w:r>
     </w:p>
     <w:p>
@@ -515,20 +538,409 @@
           <w:b/>
           <w:bCs/>
         </w:rPr>
-        <w:t xml:space="preserve">Cabeceras HTTP</w:t>
-      </w:r>
-      <w:r>
-        <w:t xml:space="preserve">: X-Frame-Options, X-Content-Type-Options, etc.</w:t>
-      </w:r>
-    </w:p>
-    <w:bookmarkEnd w:id="13"/>
-    <w:bookmarkStart w:id="14" w:name="patrones-de-diseño"/>
+        <w:t xml:space="preserve">catalogo</w:t>
+      </w:r>
+      <w:r>
+        <w:t xml:space="preserve">: Categorías y catálogos que vinculan productos con categorías</w:t>
+      </w:r>
+    </w:p>
+    <w:p>
+      <w:pPr>
+        <w:pStyle w:val="Compact"/>
+        <w:numPr>
+          <w:ilvl w:val="0"/>
+          <w:numId w:val="1002"/>
+        </w:numPr>
+      </w:pPr>
+      <w:r>
+        <w:rPr>
+          <w:b/>
+          <w:bCs/>
+        </w:rPr>
+        <w:t xml:space="preserve">core</w:t>
+      </w:r>
+      <w:r>
+        <w:t xml:space="preserve">: Capa base con servicios, repositorios, validadores y seguridad</w:t>
+      </w:r>
+    </w:p>
+    <w:bookmarkEnd w:id="11"/>
+    <w:bookmarkStart w:id="14" w:name="seed-data"/>
     <w:p>
       <w:pPr>
         <w:pStyle w:val="Heading2"/>
       </w:pPr>
       <w:r>
-        <w:t xml:space="preserve">Patrones de Diseño</w:t>
+        <w:t xml:space="preserve">Seed Data</w:t>
+      </w:r>
+    </w:p>
+    <w:p>
+      <w:pPr>
+        <w:pStyle w:val="FirstParagraph"/>
+      </w:pPr>
+      <w:r>
+        <w:t xml:space="preserve">El proyecto incluye datos de ejemplo para pruebas inmediatas. Ejecutar después de migrar:</w:t>
+      </w:r>
+    </w:p>
+    <w:p>
+      <w:pPr>
+        <w:pStyle w:val="SourceCode"/>
+      </w:pPr>
+      <w:r>
+        <w:rPr>
+          <w:rStyle w:val="ExtensionTok"/>
+        </w:rPr>
+        <w:t xml:space="preserve">python</w:t>
+      </w:r>
+      <w:r>
+        <w:rPr>
+          <w:rStyle w:val="NormalTok"/>
+        </w:rPr>
+        <w:t xml:space="preserve"> manage.py seed_data</w:t>
+      </w:r>
+    </w:p>
+    <w:bookmarkStart w:id="12" w:name="usuarios-de-prueba"/>
+    <w:p>
+      <w:pPr>
+        <w:pStyle w:val="Heading3"/>
+      </w:pPr>
+      <w:r>
+        <w:t xml:space="preserve">Usuarios de prueba</w:t>
+      </w:r>
+    </w:p>
+    <w:tbl>
+      <w:tblPr>
+        <w:tblStyle w:val="Table"/>
+        <w:tblW w:type="auto" w:w="0"/>
+        <w:tblLook w:firstRow="1" w:lastRow="0" w:firstColumn="0" w:lastColumn="0" w:noHBand="0" w:noVBand="0" w:val="0020"/>
+      </w:tblPr>
+      <w:tblGrid>
+        <w:gridCol w:w="1584"/>
+        <w:gridCol w:w="1584"/>
+        <w:gridCol w:w="1584"/>
+        <w:gridCol w:w="1584"/>
+        <w:gridCol w:w="1584"/>
+      </w:tblGrid>
+      <w:tr>
+        <w:trPr>
+          <w:tblHeader w:val="on"/>
+        </w:trPr>
+        <w:tc>
+          <w:tcPr/>
+          <w:p>
+            <w:pPr>
+              <w:pStyle w:val="Compact"/>
+            </w:pPr>
+            <w:r>
+              <w:t xml:space="preserve">Usuario</w:t>
+            </w:r>
+          </w:p>
+        </w:tc>
+        <w:tc>
+          <w:tcPr/>
+          <w:p>
+            <w:pPr>
+              <w:pStyle w:val="Compact"/>
+            </w:pPr>
+            <w:r>
+              <w:t xml:space="preserve">Rol</w:t>
+            </w:r>
+          </w:p>
+        </w:tc>
+        <w:tc>
+          <w:tcPr/>
+          <w:p>
+            <w:pPr>
+              <w:pStyle w:val="Compact"/>
+            </w:pPr>
+            <w:r>
+              <w:t xml:space="preserve">Password</w:t>
+            </w:r>
+          </w:p>
+        </w:tc>
+        <w:tc>
+          <w:tcPr/>
+          <w:p>
+            <w:pPr>
+              <w:pStyle w:val="Compact"/>
+            </w:pPr>
+            <w:r>
+              <w:t xml:space="preserve">Staff</w:t>
+            </w:r>
+          </w:p>
+        </w:tc>
+        <w:tc>
+          <w:tcPr/>
+          <w:p>
+            <w:pPr>
+              <w:pStyle w:val="Compact"/>
+            </w:pPr>
+            <w:r>
+              <w:t xml:space="preserve">Superuser</w:t>
+            </w:r>
+          </w:p>
+        </w:tc>
+      </w:tr>
+      <w:tr>
+        <w:tc>
+          <w:tcPr/>
+          <w:p>
+            <w:pPr>
+              <w:pStyle w:val="Compact"/>
+            </w:pPr>
+            <w:r>
+              <w:rPr>
+                <w:rStyle w:val="VerbatimChar"/>
+              </w:rPr>
+              <w:t xml:space="preserve">admin</w:t>
+            </w:r>
+          </w:p>
+        </w:tc>
+        <w:tc>
+          <w:tcPr/>
+          <w:p>
+            <w:pPr>
+              <w:pStyle w:val="Compact"/>
+            </w:pPr>
+            <w:r>
+              <w:t xml:space="preserve">Administrador</w:t>
+            </w:r>
+          </w:p>
+        </w:tc>
+        <w:tc>
+          <w:tcPr/>
+          <w:p>
+            <w:pPr>
+              <w:pStyle w:val="Compact"/>
+            </w:pPr>
+            <w:r>
+              <w:rPr>
+                <w:rStyle w:val="VerbatimChar"/>
+              </w:rPr>
+              <w:t xml:space="preserve">admin123</w:t>
+            </w:r>
+          </w:p>
+        </w:tc>
+        <w:tc>
+          <w:tcPr/>
+          <w:p>
+            <w:pPr>
+              <w:pStyle w:val="Compact"/>
+            </w:pPr>
+            <w:r>
+              <w:t xml:space="preserve">✅</w:t>
+            </w:r>
+          </w:p>
+        </w:tc>
+        <w:tc>
+          <w:tcPr/>
+          <w:p>
+            <w:pPr>
+              <w:pStyle w:val="Compact"/>
+            </w:pPr>
+            <w:r>
+              <w:t xml:space="preserve">✅</w:t>
+            </w:r>
+          </w:p>
+        </w:tc>
+      </w:tr>
+      <w:tr>
+        <w:tc>
+          <w:tcPr/>
+          <w:p>
+            <w:pPr>
+              <w:pStyle w:val="Compact"/>
+            </w:pPr>
+            <w:r>
+              <w:rPr>
+                <w:rStyle w:val="VerbatimChar"/>
+              </w:rPr>
+              <w:t xml:space="preserve">gestor</w:t>
+            </w:r>
+          </w:p>
+        </w:tc>
+        <w:tc>
+          <w:tcPr/>
+          <w:p>
+            <w:pPr>
+              <w:pStyle w:val="Compact"/>
+            </w:pPr>
+            <w:r>
+              <w:t xml:space="preserve">Gestor</w:t>
+            </w:r>
+          </w:p>
+        </w:tc>
+        <w:tc>
+          <w:tcPr/>
+          <w:p>
+            <w:pPr>
+              <w:pStyle w:val="Compact"/>
+            </w:pPr>
+            <w:r>
+              <w:rPr>
+                <w:rStyle w:val="VerbatimChar"/>
+              </w:rPr>
+              <w:t xml:space="preserve">gestor123</w:t>
+            </w:r>
+          </w:p>
+        </w:tc>
+        <w:tc>
+          <w:tcPr/>
+          <w:p>
+            <w:pPr>
+              <w:pStyle w:val="Compact"/>
+            </w:pPr>
+            <w:r>
+              <w:t xml:space="preserve">✅</w:t>
+            </w:r>
+          </w:p>
+        </w:tc>
+        <w:tc>
+          <w:tcPr/>
+          <w:p>
+            <w:pPr>
+              <w:pStyle w:val="Compact"/>
+            </w:pPr>
+            <w:r>
+              <w:t xml:space="preserve">❌</w:t>
+            </w:r>
+          </w:p>
+        </w:tc>
+      </w:tr>
+      <w:tr>
+        <w:tc>
+          <w:tcPr/>
+          <w:p>
+            <w:pPr>
+              <w:pStyle w:val="Compact"/>
+            </w:pPr>
+            <w:r>
+              <w:rPr>
+                <w:rStyle w:val="VerbatimChar"/>
+              </w:rPr>
+              <w:t xml:space="preserve">vendedor</w:t>
+            </w:r>
+          </w:p>
+        </w:tc>
+        <w:tc>
+          <w:tcPr/>
+          <w:p>
+            <w:pPr>
+              <w:pStyle w:val="Compact"/>
+            </w:pPr>
+            <w:r>
+              <w:t xml:space="preserve">Vendedor</w:t>
+            </w:r>
+          </w:p>
+        </w:tc>
+        <w:tc>
+          <w:tcPr/>
+          <w:p>
+            <w:pPr>
+              <w:pStyle w:val="Compact"/>
+            </w:pPr>
+            <w:r>
+              <w:rPr>
+                <w:rStyle w:val="VerbatimChar"/>
+              </w:rPr>
+              <w:t xml:space="preserve">vendedor123</w:t>
+            </w:r>
+          </w:p>
+        </w:tc>
+        <w:tc>
+          <w:tcPr/>
+          <w:p>
+            <w:pPr>
+              <w:pStyle w:val="Compact"/>
+            </w:pPr>
+            <w:r>
+              <w:t xml:space="preserve">❌</w:t>
+            </w:r>
+          </w:p>
+        </w:tc>
+        <w:tc>
+          <w:tcPr/>
+          <w:p>
+            <w:pPr>
+              <w:pStyle w:val="Compact"/>
+            </w:pPr>
+            <w:r>
+              <w:t xml:space="preserve">❌</w:t>
+            </w:r>
+          </w:p>
+        </w:tc>
+      </w:tr>
+      <w:tr>
+        <w:tc>
+          <w:tcPr/>
+          <w:p>
+            <w:pPr>
+              <w:pStyle w:val="Compact"/>
+            </w:pPr>
+            <w:r>
+              <w:rPr>
+                <w:rStyle w:val="VerbatimChar"/>
+              </w:rPr>
+              <w:t xml:space="preserve">cliente</w:t>
+            </w:r>
+          </w:p>
+        </w:tc>
+        <w:tc>
+          <w:tcPr/>
+          <w:p>
+            <w:pPr>
+              <w:pStyle w:val="Compact"/>
+            </w:pPr>
+            <w:r>
+              <w:t xml:space="preserve">Cliente</w:t>
+            </w:r>
+          </w:p>
+        </w:tc>
+        <w:tc>
+          <w:tcPr/>
+          <w:p>
+            <w:pPr>
+              <w:pStyle w:val="Compact"/>
+            </w:pPr>
+            <w:r>
+              <w:rPr>
+                <w:rStyle w:val="VerbatimChar"/>
+              </w:rPr>
+              <w:t xml:space="preserve">cliente123</w:t>
+            </w:r>
+          </w:p>
+        </w:tc>
+        <w:tc>
+          <w:tcPr/>
+          <w:p>
+            <w:pPr>
+              <w:pStyle w:val="Compact"/>
+            </w:pPr>
+            <w:r>
+              <w:t xml:space="preserve">❌</w:t>
+            </w:r>
+          </w:p>
+        </w:tc>
+        <w:tc>
+          <w:tcPr/>
+          <w:p>
+            <w:pPr>
+              <w:pStyle w:val="Compact"/>
+            </w:pPr>
+            <w:r>
+              <w:t xml:space="preserve">❌</w:t>
+            </w:r>
+          </w:p>
+        </w:tc>
+      </w:tr>
+    </w:tbl>
+    <w:bookmarkEnd w:id="12"/>
+    <w:bookmarkStart w:id="13" w:name="datos-incluidos"/>
+    <w:p>
+      <w:pPr>
+        <w:pStyle w:val="Heading3"/>
+      </w:pPr>
+      <w:r>
+        <w:t xml:space="preserve">Datos incluidos</w:t>
       </w:r>
     </w:p>
     <w:p>
@@ -544,10 +956,13 @@
           <w:b/>
           <w:bCs/>
         </w:rPr>
-        <w:t xml:space="preserve">Singleton</w:t>
-      </w:r>
-      <w:r>
-        <w:t xml:space="preserve">: Core services (CrudService instancia única)</w:t>
+        <w:t xml:space="preserve">8 registros</w:t>
+      </w:r>
+      <w:r>
+        <w:t xml:space="preserve"> </w:t>
+      </w:r>
+      <w:r>
+        <w:t xml:space="preserve">de clientes colombianos (Bogotá, Medellín, Cali, Barranquilla, etc.)</w:t>
       </w:r>
     </w:p>
     <w:p>
@@ -563,10 +978,10 @@
           <w:b/>
           <w:bCs/>
         </w:rPr>
-        <w:t xml:space="preserve">Repository</w:t>
-      </w:r>
-      <w:r>
-        <w:t xml:space="preserve">: Capa de acceso a datos (DjangoRepository)</w:t>
+        <w:t xml:space="preserve">6 categorías</w:t>
+      </w:r>
+      <w:r>
+        <w:t xml:space="preserve">: Electrónica, Ropa y Accesorios, Hogar, Deportes, Libros, Juguetes</w:t>
       </w:r>
     </w:p>
     <w:p>
@@ -582,10 +997,13 @@
           <w:b/>
           <w:bCs/>
         </w:rPr>
-        <w:t xml:space="preserve">Template Method</w:t>
-      </w:r>
-      <w:r>
-        <w:t xml:space="preserve">: BaseModel con métodos abstractos</w:t>
+        <w:t xml:space="preserve">12 productos</w:t>
+      </w:r>
+      <w:r>
+        <w:t xml:space="preserve"> </w:t>
+      </w:r>
+      <w:r>
+        <w:t xml:space="preserve">con precios en COP y stock</w:t>
       </w:r>
     </w:p>
     <w:p>
@@ -601,20 +1019,525 @@
           <w:b/>
           <w:bCs/>
         </w:rPr>
-        <w:t xml:space="preserve">ModelForm</w:t>
-      </w:r>
-      <w:r>
-        <w:t xml:space="preserve">: Generación automática de formularios (DRY)</w:t>
-      </w:r>
-    </w:p>
+        <w:t xml:space="preserve">8 catálogos</w:t>
+      </w:r>
+      <w:r>
+        <w:t xml:space="preserve"> </w:t>
+      </w:r>
+      <w:r>
+        <w:t xml:space="preserve">vinculando productos a categorías</w:t>
+      </w:r>
+    </w:p>
+    <w:bookmarkEnd w:id="13"/>
     <w:bookmarkEnd w:id="14"/>
-    <w:bookmarkStart w:id="27" w:name="documentación-de-modelos-y-diagramas"/>
+    <w:bookmarkStart w:id="15" w:name="roles-del-sistema"/>
     <w:p>
       <w:pPr>
         <w:pStyle w:val="Heading2"/>
       </w:pPr>
       <w:r>
-        <w:t xml:space="preserve">Documentación de Modelos y Diagramas</w:t>
+        <w:t xml:space="preserve">Roles del Sistema</w:t>
+      </w:r>
+    </w:p>
+    <w:tbl>
+      <w:tblPr>
+        <w:tblStyle w:val="Table"/>
+        <w:tblW w:type="pct" w:w="5000"/>
+        <w:tblLayout w:type="fixed"/>
+        <w:tblLook w:firstRow="1" w:lastRow="0" w:firstColumn="0" w:lastColumn="0" w:noHBand="0" w:noVBand="0" w:val="0020"/>
+      </w:tblPr>
+      <w:tblGrid>
+        <w:gridCol w:w="1523"/>
+        <w:gridCol w:w="3960"/>
+        <w:gridCol w:w="2436"/>
+      </w:tblGrid>
+      <w:tr>
+        <w:trPr>
+          <w:tblHeader w:val="on"/>
+        </w:trPr>
+        <w:tc>
+          <w:tcPr/>
+          <w:p>
+            <w:pPr>
+              <w:pStyle w:val="Compact"/>
+            </w:pPr>
+            <w:r>
+              <w:t xml:space="preserve">Rol</w:t>
+            </w:r>
+          </w:p>
+        </w:tc>
+        <w:tc>
+          <w:tcPr/>
+          <w:p>
+            <w:pPr>
+              <w:pStyle w:val="Compact"/>
+            </w:pPr>
+            <w:r>
+              <w:t xml:space="preserve">Descripción</w:t>
+            </w:r>
+          </w:p>
+        </w:tc>
+        <w:tc>
+          <w:tcPr/>
+          <w:p>
+            <w:pPr>
+              <w:pStyle w:val="Compact"/>
+            </w:pPr>
+            <w:r>
+              <w:t xml:space="preserve">Acceso</w:t>
+            </w:r>
+          </w:p>
+        </w:tc>
+      </w:tr>
+      <w:tr>
+        <w:tc>
+          <w:tcPr/>
+          <w:p>
+            <w:pPr>
+              <w:pStyle w:val="Compact"/>
+            </w:pPr>
+            <w:r>
+              <w:t xml:space="preserve">Cliente</w:t>
+            </w:r>
+          </w:p>
+        </w:tc>
+        <w:tc>
+          <w:tcPr/>
+          <w:p>
+            <w:pPr>
+              <w:pStyle w:val="Compact"/>
+            </w:pPr>
+            <w:r>
+              <w:t xml:space="preserve">Acceso básico de lectura</w:t>
+            </w:r>
+          </w:p>
+        </w:tc>
+        <w:tc>
+          <w:tcPr/>
+          <w:p>
+            <w:pPr>
+              <w:pStyle w:val="Compact"/>
+            </w:pPr>
+            <w:r>
+              <w:t xml:space="preserve">Ver registros, perfil</w:t>
+            </w:r>
+          </w:p>
+        </w:tc>
+      </w:tr>
+      <w:tr>
+        <w:tc>
+          <w:tcPr/>
+          <w:p>
+            <w:pPr>
+              <w:pStyle w:val="Compact"/>
+            </w:pPr>
+            <w:r>
+              <w:t xml:space="preserve">Vendedor</w:t>
+            </w:r>
+          </w:p>
+        </w:tc>
+        <w:tc>
+          <w:tcPr/>
+          <w:p>
+            <w:pPr>
+              <w:pStyle w:val="Compact"/>
+            </w:pPr>
+            <w:r>
+              <w:t xml:space="preserve">Gestión de clientes y productos</w:t>
+            </w:r>
+          </w:p>
+        </w:tc>
+        <w:tc>
+          <w:tcPr/>
+          <w:p>
+            <w:pPr>
+              <w:pStyle w:val="Compact"/>
+            </w:pPr>
+            <w:r>
+              <w:t xml:space="preserve">CRUD clientes, CRUD productos</w:t>
+            </w:r>
+          </w:p>
+        </w:tc>
+      </w:tr>
+      <w:tr>
+        <w:tc>
+          <w:tcPr/>
+          <w:p>
+            <w:pPr>
+              <w:pStyle w:val="Compact"/>
+            </w:pPr>
+            <w:r>
+              <w:t xml:space="preserve">Gestor</w:t>
+            </w:r>
+          </w:p>
+        </w:tc>
+        <w:tc>
+          <w:tcPr/>
+          <w:p>
+            <w:pPr>
+              <w:pStyle w:val="Compact"/>
+            </w:pPr>
+            <w:r>
+              <w:t xml:space="preserve">Administración de catálogos</w:t>
+            </w:r>
+          </w:p>
+        </w:tc>
+        <w:tc>
+          <w:tcPr/>
+          <w:p>
+            <w:pPr>
+              <w:pStyle w:val="Compact"/>
+            </w:pPr>
+            <w:r>
+              <w:t xml:space="preserve">CRUD clientes, CRUD productos, CRUD catálogos</w:t>
+            </w:r>
+          </w:p>
+        </w:tc>
+      </w:tr>
+      <w:tr>
+        <w:tc>
+          <w:tcPr/>
+          <w:p>
+            <w:pPr>
+              <w:pStyle w:val="Compact"/>
+            </w:pPr>
+            <w:r>
+              <w:t xml:space="preserve">Admin</w:t>
+            </w:r>
+          </w:p>
+        </w:tc>
+        <w:tc>
+          <w:tcPr/>
+          <w:p>
+            <w:pPr>
+              <w:pStyle w:val="Compact"/>
+            </w:pPr>
+            <w:r>
+              <w:t xml:space="preserve">Acceso completo</w:t>
+            </w:r>
+          </w:p>
+        </w:tc>
+        <w:tc>
+          <w:tcPr/>
+          <w:p>
+            <w:pPr>
+              <w:pStyle w:val="Compact"/>
+            </w:pPr>
+            <w:r>
+              <w:t xml:space="preserve">Todo + panel Django admin + gestión usuarios</w:t>
+            </w:r>
+          </w:p>
+        </w:tc>
+      </w:tr>
+    </w:tbl>
+    <w:bookmarkEnd w:id="15"/>
+    <w:bookmarkStart w:id="18" w:name="instalación-desarrollo-local"/>
+    <w:p>
+      <w:pPr>
+        <w:pStyle w:val="Heading2"/>
+      </w:pPr>
+      <w:r>
+        <w:t xml:space="preserve">Instalación (Desarrollo Local)</w:t>
+      </w:r>
+    </w:p>
+    <w:bookmarkStart w:id="16" w:name="requisitos"/>
+    <w:p>
+      <w:pPr>
+        <w:pStyle w:val="Heading3"/>
+      </w:pPr>
+      <w:r>
+        <w:t xml:space="preserve">Requisitos</w:t>
+      </w:r>
+    </w:p>
+    <w:p>
+      <w:pPr>
+        <w:pStyle w:val="Compact"/>
+        <w:numPr>
+          <w:ilvl w:val="0"/>
+          <w:numId w:val="1004"/>
+        </w:numPr>
+      </w:pPr>
+      <w:r>
+        <w:t xml:space="preserve">Python 3.12+</w:t>
+      </w:r>
+    </w:p>
+    <w:p>
+      <w:pPr>
+        <w:pStyle w:val="Compact"/>
+        <w:numPr>
+          <w:ilvl w:val="0"/>
+          <w:numId w:val="1004"/>
+        </w:numPr>
+      </w:pPr>
+      <w:r>
+        <w:t xml:space="preserve">pip</w:t>
+      </w:r>
+    </w:p>
+    <w:p>
+      <w:pPr>
+        <w:pStyle w:val="Compact"/>
+        <w:numPr>
+          <w:ilvl w:val="0"/>
+          <w:numId w:val="1004"/>
+        </w:numPr>
+      </w:pPr>
+      <w:r>
+        <w:t xml:space="preserve">virtualenv (recomendado)</w:t>
+      </w:r>
+    </w:p>
+    <w:bookmarkEnd w:id="16"/>
+    <w:bookmarkStart w:id="17" w:name="pasos"/>
+    <w:p>
+      <w:pPr>
+        <w:pStyle w:val="Heading3"/>
+      </w:pPr>
+      <w:r>
+        <w:t xml:space="preserve">Pasos</w:t>
+      </w:r>
+    </w:p>
+    <w:p>
+      <w:pPr>
+        <w:pStyle w:val="SourceCode"/>
+      </w:pPr>
+      <w:r>
+        <w:rPr>
+          <w:rStyle w:val="CommentTok"/>
+        </w:rPr>
+        <w:t xml:space="preserve"># Clonar repositorio</w:t>
+      </w:r>
+      <w:r>
+        <w:br/>
+      </w:r>
+      <w:r>
+        <w:rPr>
+          <w:rStyle w:val="FunctionTok"/>
+        </w:rPr>
+        <w:t xml:space="preserve">git</w:t>
+      </w:r>
+      <w:r>
+        <w:rPr>
+          <w:rStyle w:val="NormalTok"/>
+        </w:rPr>
+        <w:t xml:space="preserve"> clone https://github.com/josuel-munendez/ProyectoDJviernes.git</w:t>
+      </w:r>
+      <w:r>
+        <w:br/>
+      </w:r>
+      <w:r>
+        <w:rPr>
+          <w:rStyle w:val="BuiltInTok"/>
+        </w:rPr>
+        <w:t xml:space="preserve">cd</w:t>
+      </w:r>
+      <w:r>
+        <w:rPr>
+          <w:rStyle w:val="NormalTok"/>
+        </w:rPr>
+        <w:t xml:space="preserve"> ProyectoDJviernes</w:t>
+      </w:r>
+      <w:r>
+        <w:br/>
+      </w:r>
+      <w:r>
+        <w:br/>
+      </w:r>
+      <w:r>
+        <w:rPr>
+          <w:rStyle w:val="CommentTok"/>
+        </w:rPr>
+        <w:t xml:space="preserve"># Crear y activar entorno virtual</w:t>
+      </w:r>
+      <w:r>
+        <w:br/>
+      </w:r>
+      <w:r>
+        <w:rPr>
+          <w:rStyle w:val="ExtensionTok"/>
+        </w:rPr>
+        <w:t xml:space="preserve">python</w:t>
+      </w:r>
+      <w:r>
+        <w:rPr>
+          <w:rStyle w:val="NormalTok"/>
+        </w:rPr>
+        <w:t xml:space="preserve"> </w:t>
+      </w:r>
+      <w:r>
+        <w:rPr>
+          <w:rStyle w:val="AttributeTok"/>
+        </w:rPr>
+        <w:t xml:space="preserve">-m</w:t>
+      </w:r>
+      <w:r>
+        <w:rPr>
+          <w:rStyle w:val="NormalTok"/>
+        </w:rPr>
+        <w:t xml:space="preserve"> venv entorno</w:t>
+      </w:r>
+      <w:r>
+        <w:br/>
+      </w:r>
+      <w:r>
+        <w:rPr>
+          <w:rStyle w:val="BuiltInTok"/>
+        </w:rPr>
+        <w:t xml:space="preserve">source</w:t>
+      </w:r>
+      <w:r>
+        <w:rPr>
+          <w:rStyle w:val="NormalTok"/>
+        </w:rPr>
+        <w:t xml:space="preserve"> entorno/bin/activate  </w:t>
+      </w:r>
+      <w:r>
+        <w:rPr>
+          <w:rStyle w:val="CommentTok"/>
+        </w:rPr>
+        <w:t xml:space="preserve"># Linux/Mac</w:t>
+      </w:r>
+      <w:r>
+        <w:br/>
+      </w:r>
+      <w:r>
+        <w:rPr>
+          <w:rStyle w:val="CommentTok"/>
+        </w:rPr>
+        <w:t xml:space="preserve"># .\entorno\Scripts\activate  # Windows</w:t>
+      </w:r>
+      <w:r>
+        <w:br/>
+      </w:r>
+      <w:r>
+        <w:br/>
+      </w:r>
+      <w:r>
+        <w:rPr>
+          <w:rStyle w:val="CommentTok"/>
+        </w:rPr>
+        <w:t xml:space="preserve"># Instalar dependencias</w:t>
+      </w:r>
+      <w:r>
+        <w:br/>
+      </w:r>
+      <w:r>
+        <w:rPr>
+          <w:rStyle w:val="ExtensionTok"/>
+        </w:rPr>
+        <w:t xml:space="preserve">pip</w:t>
+      </w:r>
+      <w:r>
+        <w:rPr>
+          <w:rStyle w:val="NormalTok"/>
+        </w:rPr>
+        <w:t xml:space="preserve"> install </w:t>
+      </w:r>
+      <w:r>
+        <w:rPr>
+          <w:rStyle w:val="AttributeTok"/>
+        </w:rPr>
+        <w:t xml:space="preserve">-r</w:t>
+      </w:r>
+      <w:r>
+        <w:rPr>
+          <w:rStyle w:val="NormalTok"/>
+        </w:rPr>
+        <w:t xml:space="preserve"> requirements.txt</w:t>
+      </w:r>
+      <w:r>
+        <w:br/>
+      </w:r>
+      <w:r>
+        <w:br/>
+      </w:r>
+      <w:r>
+        <w:rPr>
+          <w:rStyle w:val="CommentTok"/>
+        </w:rPr>
+        <w:t xml:space="preserve"># Migrar base de datos</w:t>
+      </w:r>
+      <w:r>
+        <w:br/>
+      </w:r>
+      <w:r>
+        <w:rPr>
+          <w:rStyle w:val="BuiltInTok"/>
+        </w:rPr>
+        <w:t xml:space="preserve">cd</w:t>
+      </w:r>
+      <w:r>
+        <w:rPr>
+          <w:rStyle w:val="NormalTok"/>
+        </w:rPr>
+        <w:t xml:space="preserve"> dcrm</w:t>
+      </w:r>
+      <w:r>
+        <w:br/>
+      </w:r>
+      <w:r>
+        <w:rPr>
+          <w:rStyle w:val="ExtensionTok"/>
+        </w:rPr>
+        <w:t xml:space="preserve">python</w:t>
+      </w:r>
+      <w:r>
+        <w:rPr>
+          <w:rStyle w:val="NormalTok"/>
+        </w:rPr>
+        <w:t xml:space="preserve"> manage.py migrate</w:t>
+      </w:r>
+      <w:r>
+        <w:br/>
+      </w:r>
+      <w:r>
+        <w:br/>
+      </w:r>
+      <w:r>
+        <w:rPr>
+          <w:rStyle w:val="CommentTok"/>
+        </w:rPr>
+        <w:t xml:space="preserve"># Cargar datos de ejemplo</w:t>
+      </w:r>
+      <w:r>
+        <w:br/>
+      </w:r>
+      <w:r>
+        <w:rPr>
+          <w:rStyle w:val="ExtensionTok"/>
+        </w:rPr>
+        <w:t xml:space="preserve">python</w:t>
+      </w:r>
+      <w:r>
+        <w:rPr>
+          <w:rStyle w:val="NormalTok"/>
+        </w:rPr>
+        <w:t xml:space="preserve"> manage.py seed_data</w:t>
+      </w:r>
+      <w:r>
+        <w:br/>
+      </w:r>
+      <w:r>
+        <w:br/>
+      </w:r>
+      <w:r>
+        <w:rPr>
+          <w:rStyle w:val="CommentTok"/>
+        </w:rPr>
+        <w:t xml:space="preserve"># Iniciar servidor de desarrollo</w:t>
+      </w:r>
+      <w:r>
+        <w:br/>
+      </w:r>
+      <w:r>
+        <w:rPr>
+          <w:rStyle w:val="ExtensionTok"/>
+        </w:rPr>
+        <w:t xml:space="preserve">python</w:t>
+      </w:r>
+      <w:r>
+        <w:rPr>
+          <w:rStyle w:val="NormalTok"/>
+        </w:rPr>
+        <w:t xml:space="preserve"> manage.py runserver</w:t>
       </w:r>
     </w:p>
     <w:p>
@@ -622,6 +1545,807 @@
         <w:pStyle w:val="FirstParagraph"/>
       </w:pPr>
       <w:r>
+        <w:t xml:space="preserve">Acceder en http://localhost:8000</w:t>
+      </w:r>
+    </w:p>
+    <w:bookmarkEnd w:id="17"/>
+    <w:bookmarkEnd w:id="18"/>
+    <w:bookmarkStart w:id="21" w:name="X39f9a95fe6c622e1665dd316cee1f8c3a570a6e"/>
+    <w:p>
+      <w:pPr>
+        <w:pStyle w:val="Heading2"/>
+      </w:pPr>
+      <w:r>
+        <w:t xml:space="preserve">Despliegue con Contenedores (Docker / Podman)</w:t>
+      </w:r>
+    </w:p>
+    <w:bookmarkStart w:id="19" w:name="construir-y-ejecutar"/>
+    <w:p>
+      <w:pPr>
+        <w:pStyle w:val="Heading3"/>
+      </w:pPr>
+      <w:r>
+        <w:t xml:space="preserve">Construir y ejecutar</w:t>
+      </w:r>
+    </w:p>
+    <w:p>
+      <w:pPr>
+        <w:pStyle w:val="SourceCode"/>
+      </w:pPr>
+      <w:r>
+        <w:rPr>
+          <w:rStyle w:val="CommentTok"/>
+        </w:rPr>
+        <w:t xml:space="preserve"># Usando docker-compose</w:t>
+      </w:r>
+      <w:r>
+        <w:br/>
+      </w:r>
+      <w:r>
+        <w:rPr>
+          <w:rStyle w:val="ExtensionTok"/>
+        </w:rPr>
+        <w:t xml:space="preserve">docker</w:t>
+      </w:r>
+      <w:r>
+        <w:rPr>
+          <w:rStyle w:val="NormalTok"/>
+        </w:rPr>
+        <w:t xml:space="preserve"> compose up </w:t>
+      </w:r>
+      <w:r>
+        <w:rPr>
+          <w:rStyle w:val="AttributeTok"/>
+        </w:rPr>
+        <w:t xml:space="preserve">-d</w:t>
+      </w:r>
+      <w:r>
+        <w:br/>
+      </w:r>
+      <w:r>
+        <w:br/>
+      </w:r>
+      <w:r>
+        <w:rPr>
+          <w:rStyle w:val="CommentTok"/>
+        </w:rPr>
+        <w:t xml:space="preserve"># O usando podman-compose</w:t>
+      </w:r>
+      <w:r>
+        <w:br/>
+      </w:r>
+      <w:r>
+        <w:rPr>
+          <w:rStyle w:val="ExtensionTok"/>
+        </w:rPr>
+        <w:t xml:space="preserve">podman-compose</w:t>
+      </w:r>
+      <w:r>
+        <w:rPr>
+          <w:rStyle w:val="NormalTok"/>
+        </w:rPr>
+        <w:t xml:space="preserve"> up </w:t>
+      </w:r>
+      <w:r>
+        <w:rPr>
+          <w:rStyle w:val="AttributeTok"/>
+        </w:rPr>
+        <w:t xml:space="preserve">-d</w:t>
+      </w:r>
+    </w:p>
+    <w:p>
+      <w:pPr>
+        <w:pStyle w:val="FirstParagraph"/>
+      </w:pPr>
+      <w:r>
+        <w:t xml:space="preserve">El contenedor ejecuta automáticamente:</w:t>
+      </w:r>
+      <w:r>
+        <w:t xml:space="preserve"> </w:t>
+      </w:r>
+      <w:r>
+        <w:t xml:space="preserve">1. Migraciones de base de datos</w:t>
+      </w:r>
+      <w:r>
+        <w:t xml:space="preserve"> </w:t>
+      </w:r>
+      <w:r>
+        <w:t xml:space="preserve">2. Recolección de archivos estáticos</w:t>
+      </w:r>
+      <w:r>
+        <w:t xml:space="preserve"> </w:t>
+      </w:r>
+      <w:r>
+        <w:t xml:space="preserve">3. Carga de seed data (solo si la BD está vacía)</w:t>
+      </w:r>
+      <w:r>
+        <w:t xml:space="preserve"> </w:t>
+      </w:r>
+      <w:r>
+        <w:t xml:space="preserve">4. Servidor Gunicorn en puerto 8000</w:t>
+      </w:r>
+    </w:p>
+    <w:p>
+      <w:pPr>
+        <w:pStyle w:val="BodyText"/>
+      </w:pPr>
+      <w:r>
+        <w:t xml:space="preserve">La base de datos persiste en un volumen Docker.</w:t>
+      </w:r>
+    </w:p>
+    <w:bookmarkEnd w:id="19"/>
+    <w:bookmarkStart w:id="20" w:name="variables-de-entorno"/>
+    <w:p>
+      <w:pPr>
+        <w:pStyle w:val="Heading3"/>
+      </w:pPr>
+      <w:r>
+        <w:t xml:space="preserve">Variables de entorno</w:t>
+      </w:r>
+    </w:p>
+    <w:tbl>
+      <w:tblPr>
+        <w:tblStyle w:val="Table"/>
+        <w:tblW w:type="pct" w:w="5000"/>
+        <w:tblLayout w:type="fixed"/>
+        <w:tblLook w:firstRow="1" w:lastRow="0" w:firstColumn="0" w:lastColumn="0" w:noHBand="0" w:noVBand="0" w:val="0020"/>
+      </w:tblPr>
+      <w:tblGrid>
+        <w:gridCol w:w="2475"/>
+        <w:gridCol w:w="2227"/>
+        <w:gridCol w:w="3217"/>
+      </w:tblGrid>
+      <w:tr>
+        <w:trPr>
+          <w:tblHeader w:val="on"/>
+        </w:trPr>
+        <w:tc>
+          <w:tcPr/>
+          <w:p>
+            <w:pPr>
+              <w:pStyle w:val="Compact"/>
+            </w:pPr>
+            <w:r>
+              <w:t xml:space="preserve">Variable</w:t>
+            </w:r>
+          </w:p>
+        </w:tc>
+        <w:tc>
+          <w:tcPr/>
+          <w:p>
+            <w:pPr>
+              <w:pStyle w:val="Compact"/>
+            </w:pPr>
+            <w:r>
+              <w:t xml:space="preserve">Default</w:t>
+            </w:r>
+          </w:p>
+        </w:tc>
+        <w:tc>
+          <w:tcPr/>
+          <w:p>
+            <w:pPr>
+              <w:pStyle w:val="Compact"/>
+            </w:pPr>
+            <w:r>
+              <w:t xml:space="preserve">Descripción</w:t>
+            </w:r>
+          </w:p>
+        </w:tc>
+      </w:tr>
+      <w:tr>
+        <w:tc>
+          <w:tcPr/>
+          <w:p>
+            <w:pPr>
+              <w:pStyle w:val="Compact"/>
+            </w:pPr>
+            <w:r>
+              <w:rPr>
+                <w:rStyle w:val="VerbatimChar"/>
+              </w:rPr>
+              <w:t xml:space="preserve">DJANGO_SECRET_KEY</w:t>
+            </w:r>
+          </w:p>
+        </w:tc>
+        <w:tc>
+          <w:tcPr/>
+          <w:p>
+            <w:pPr>
+              <w:pStyle w:val="Compact"/>
+            </w:pPr>
+            <w:r>
+              <w:t xml:space="preserve">(key por defecto)</w:t>
+            </w:r>
+          </w:p>
+        </w:tc>
+        <w:tc>
+          <w:tcPr/>
+          <w:p>
+            <w:pPr>
+              <w:pStyle w:val="Compact"/>
+            </w:pPr>
+            <w:r>
+              <w:t xml:space="preserve">Clave secreta de Django</w:t>
+            </w:r>
+          </w:p>
+        </w:tc>
+      </w:tr>
+      <w:tr>
+        <w:tc>
+          <w:tcPr/>
+          <w:p>
+            <w:pPr>
+              <w:pStyle w:val="Compact"/>
+            </w:pPr>
+            <w:r>
+              <w:rPr>
+                <w:rStyle w:val="VerbatimChar"/>
+              </w:rPr>
+              <w:t xml:space="preserve">DJANGO_DEBUG</w:t>
+            </w:r>
+          </w:p>
+        </w:tc>
+        <w:tc>
+          <w:tcPr/>
+          <w:p>
+            <w:pPr>
+              <w:pStyle w:val="Compact"/>
+            </w:pPr>
+            <w:r>
+              <w:rPr>
+                <w:rStyle w:val="VerbatimChar"/>
+              </w:rPr>
+              <w:t xml:space="preserve">False</w:t>
+            </w:r>
+          </w:p>
+        </w:tc>
+        <w:tc>
+          <w:tcPr/>
+          <w:p>
+            <w:pPr>
+              <w:pStyle w:val="Compact"/>
+            </w:pPr>
+            <w:r>
+              <w:t xml:space="preserve">Modo debug (True/False)</w:t>
+            </w:r>
+          </w:p>
+        </w:tc>
+      </w:tr>
+      <w:tr>
+        <w:tc>
+          <w:tcPr/>
+          <w:p>
+            <w:pPr>
+              <w:pStyle w:val="Compact"/>
+            </w:pPr>
+            <w:r>
+              <w:rPr>
+                <w:rStyle w:val="VerbatimChar"/>
+              </w:rPr>
+              <w:t xml:space="preserve">DJANGO_ALLOWED_HOSTS</w:t>
+            </w:r>
+          </w:p>
+        </w:tc>
+        <w:tc>
+          <w:tcPr/>
+          <w:p>
+            <w:pPr>
+              <w:pStyle w:val="Compact"/>
+            </w:pPr>
+            <w:r>
+              <w:rPr>
+                <w:rStyle w:val="VerbatimChar"/>
+              </w:rPr>
+              <w:t xml:space="preserve">localhost,127.0.0.1,0.0.0.0</w:t>
+            </w:r>
+          </w:p>
+        </w:tc>
+        <w:tc>
+          <w:tcPr/>
+          <w:p>
+            <w:pPr>
+              <w:pStyle w:val="Compact"/>
+            </w:pPr>
+            <w:r>
+              <w:t xml:space="preserve">Hosts permitidos</w:t>
+            </w:r>
+          </w:p>
+        </w:tc>
+      </w:tr>
+      <w:tr>
+        <w:tc>
+          <w:tcPr/>
+          <w:p>
+            <w:pPr>
+              <w:pStyle w:val="Compact"/>
+            </w:pPr>
+            <w:r>
+              <w:rPr>
+                <w:rStyle w:val="VerbatimChar"/>
+              </w:rPr>
+              <w:t xml:space="preserve">DJANGO_DB_PATH</w:t>
+            </w:r>
+          </w:p>
+        </w:tc>
+        <w:tc>
+          <w:tcPr/>
+          <w:p>
+            <w:pPr>
+              <w:pStyle w:val="Compact"/>
+            </w:pPr>
+            <w:r>
+              <w:rPr>
+                <w:rStyle w:val="VerbatimChar"/>
+              </w:rPr>
+              <w:t xml:space="preserve">db.sqlite3</w:t>
+            </w:r>
+            <w:r>
+              <w:t xml:space="preserve"> </w:t>
+            </w:r>
+            <w:r>
+              <w:t xml:space="preserve">(local)</w:t>
+            </w:r>
+          </w:p>
+        </w:tc>
+        <w:tc>
+          <w:tcPr/>
+          <w:p>
+            <w:pPr>
+              <w:pStyle w:val="Compact"/>
+            </w:pPr>
+            <w:r>
+              <w:t xml:space="preserve">Ruta de la BD SQLite</w:t>
+            </w:r>
+          </w:p>
+        </w:tc>
+      </w:tr>
+    </w:tbl>
+    <w:bookmarkEnd w:id="20"/>
+    <w:bookmarkEnd w:id="21"/>
+    <w:bookmarkStart w:id="22" w:name="seguridad-4-capas"/>
+    <w:p>
+      <w:pPr>
+        <w:pStyle w:val="Heading2"/>
+      </w:pPr>
+      <w:r>
+        <w:t xml:space="preserve">Seguridad (4 Capas)</w:t>
+      </w:r>
+    </w:p>
+    <w:p>
+      <w:pPr>
+        <w:pStyle w:val="Compact"/>
+        <w:numPr>
+          <w:ilvl w:val="0"/>
+          <w:numId w:val="1005"/>
+        </w:numPr>
+      </w:pPr>
+      <w:r>
+        <w:rPr>
+          <w:b/>
+          <w:bCs/>
+        </w:rPr>
+        <w:t xml:space="preserve">Autenticación y Autorización</w:t>
+      </w:r>
+      <w:r>
+        <w:t xml:space="preserve">:</w:t>
+      </w:r>
+      <w:r>
+        <w:t xml:space="preserve"> </w:t>
+      </w:r>
+      <w:r>
+        <w:rPr>
+          <w:rStyle w:val="VerbatimChar"/>
+        </w:rPr>
+        <w:t xml:space="preserve">@login_required</w:t>
+      </w:r>
+      <w:r>
+        <w:t xml:space="preserve">, roles por perfil (Cliente/Vendedor/Gestor/Admin)</w:t>
+      </w:r>
+    </w:p>
+    <w:p>
+      <w:pPr>
+        <w:pStyle w:val="Compact"/>
+        <w:numPr>
+          <w:ilvl w:val="0"/>
+          <w:numId w:val="1005"/>
+        </w:numPr>
+      </w:pPr>
+      <w:r>
+        <w:rPr>
+          <w:b/>
+          <w:bCs/>
+        </w:rPr>
+        <w:t xml:space="preserve">CSRF</w:t>
+      </w:r>
+      <w:r>
+        <w:t xml:space="preserve">: Tokens en todos los formularios Django</w:t>
+      </w:r>
+    </w:p>
+    <w:p>
+      <w:pPr>
+        <w:pStyle w:val="Compact"/>
+        <w:numPr>
+          <w:ilvl w:val="0"/>
+          <w:numId w:val="1005"/>
+        </w:numPr>
+      </w:pPr>
+      <w:r>
+        <w:rPr>
+          <w:b/>
+          <w:bCs/>
+        </w:rPr>
+        <w:t xml:space="preserve">Validación de Entrada</w:t>
+      </w:r>
+      <w:r>
+        <w:t xml:space="preserve">: Django Forms + RegexValidator en campos críticos</w:t>
+      </w:r>
+    </w:p>
+    <w:p>
+      <w:pPr>
+        <w:pStyle w:val="Compact"/>
+        <w:numPr>
+          <w:ilvl w:val="0"/>
+          <w:numId w:val="1005"/>
+        </w:numPr>
+      </w:pPr>
+      <w:r>
+        <w:rPr>
+          <w:b/>
+          <w:bCs/>
+        </w:rPr>
+        <w:t xml:space="preserve">Cabeceras HTTP</w:t>
+      </w:r>
+      <w:r>
+        <w:t xml:space="preserve">: X-Frame-Options, X-Content-Type-Options, SESSION_COOKIE_HTTPONLY, CSRF_COOKIE_HTTPONLY, SameSite=Lax</w:t>
+      </w:r>
+    </w:p>
+    <w:bookmarkEnd w:id="22"/>
+    <w:bookmarkStart w:id="23" w:name="patrones-de-diseño-implementados"/>
+    <w:p>
+      <w:pPr>
+        <w:pStyle w:val="Heading2"/>
+      </w:pPr>
+      <w:r>
+        <w:t xml:space="preserve">Patrones de Diseño Implementados</w:t>
+      </w:r>
+    </w:p>
+    <w:tbl>
+      <w:tblPr>
+        <w:tblStyle w:val="Table"/>
+        <w:tblW w:type="pct" w:w="5000"/>
+        <w:tblLayout w:type="fixed"/>
+        <w:tblLook w:firstRow="1" w:lastRow="0" w:firstColumn="0" w:lastColumn="0" w:noHBand="0" w:noVBand="0" w:val="0020"/>
+      </w:tblPr>
+      <w:tblGrid>
+        <w:gridCol w:w="1980"/>
+        <w:gridCol w:w="2722"/>
+        <w:gridCol w:w="3217"/>
+      </w:tblGrid>
+      <w:tr>
+        <w:trPr>
+          <w:tblHeader w:val="on"/>
+        </w:trPr>
+        <w:tc>
+          <w:tcPr/>
+          <w:p>
+            <w:pPr>
+              <w:pStyle w:val="Compact"/>
+            </w:pPr>
+            <w:r>
+              <w:t xml:space="preserve">Patrón</w:t>
+            </w:r>
+          </w:p>
+        </w:tc>
+        <w:tc>
+          <w:tcPr/>
+          <w:p>
+            <w:pPr>
+              <w:pStyle w:val="Compact"/>
+            </w:pPr>
+            <w:r>
+              <w:t xml:space="preserve">Ubicación</w:t>
+            </w:r>
+          </w:p>
+        </w:tc>
+        <w:tc>
+          <w:tcPr/>
+          <w:p>
+            <w:pPr>
+              <w:pStyle w:val="Compact"/>
+            </w:pPr>
+            <w:r>
+              <w:t xml:space="preserve">Descripción</w:t>
+            </w:r>
+          </w:p>
+        </w:tc>
+      </w:tr>
+      <w:tr>
+        <w:tc>
+          <w:tcPr/>
+          <w:p>
+            <w:pPr>
+              <w:pStyle w:val="Compact"/>
+            </w:pPr>
+            <w:r>
+              <w:rPr>
+                <w:b/>
+                <w:bCs/>
+              </w:rPr>
+              <w:t xml:space="preserve">Singleton</w:t>
+            </w:r>
+          </w:p>
+        </w:tc>
+        <w:tc>
+          <w:tcPr/>
+          <w:p>
+            <w:pPr>
+              <w:pStyle w:val="Compact"/>
+            </w:pPr>
+            <w:r>
+              <w:rPr>
+                <w:rStyle w:val="VerbatimChar"/>
+              </w:rPr>
+              <w:t xml:space="preserve">core/services.py</w:t>
+            </w:r>
+            <w:r>
+              <w:t xml:space="preserve"> </w:t>
+            </w:r>
+            <w:r>
+              <w:t xml:space="preserve">(CrudService)</w:t>
+            </w:r>
+          </w:p>
+        </w:tc>
+        <w:tc>
+          <w:tcPr/>
+          <w:p>
+            <w:pPr>
+              <w:pStyle w:val="Compact"/>
+            </w:pPr>
+            <w:r>
+              <w:t xml:space="preserve">Instancia única de servicios core</w:t>
+            </w:r>
+          </w:p>
+        </w:tc>
+      </w:tr>
+      <w:tr>
+        <w:tc>
+          <w:tcPr/>
+          <w:p>
+            <w:pPr>
+              <w:pStyle w:val="Compact"/>
+            </w:pPr>
+            <w:r>
+              <w:rPr>
+                <w:b/>
+                <w:bCs/>
+              </w:rPr>
+              <w:t xml:space="preserve">Repository</w:t>
+            </w:r>
+          </w:p>
+        </w:tc>
+        <w:tc>
+          <w:tcPr/>
+          <w:p>
+            <w:pPr>
+              <w:pStyle w:val="Compact"/>
+            </w:pPr>
+            <w:r>
+              <w:rPr>
+                <w:rStyle w:val="VerbatimChar"/>
+              </w:rPr>
+              <w:t xml:space="preserve">core/repository.py</w:t>
+            </w:r>
+            <w:r>
+              <w:t xml:space="preserve"> </w:t>
+            </w:r>
+            <w:r>
+              <w:t xml:space="preserve">(DjangoRepository)</w:t>
+            </w:r>
+          </w:p>
+        </w:tc>
+        <w:tc>
+          <w:tcPr/>
+          <w:p>
+            <w:pPr>
+              <w:pStyle w:val="Compact"/>
+            </w:pPr>
+            <w:r>
+              <w:t xml:space="preserve">Capa de abstracción de acceso a datos</w:t>
+            </w:r>
+          </w:p>
+        </w:tc>
+      </w:tr>
+      <w:tr>
+        <w:tc>
+          <w:tcPr/>
+          <w:p>
+            <w:pPr>
+              <w:pStyle w:val="Compact"/>
+            </w:pPr>
+            <w:r>
+              <w:rPr>
+                <w:b/>
+                <w:bCs/>
+              </w:rPr>
+              <w:t xml:space="preserve">Template Method</w:t>
+            </w:r>
+          </w:p>
+        </w:tc>
+        <w:tc>
+          <w:tcPr/>
+          <w:p>
+            <w:pPr>
+              <w:pStyle w:val="Compact"/>
+            </w:pPr>
+            <w:r>
+              <w:rPr>
+                <w:rStyle w:val="VerbatimChar"/>
+              </w:rPr>
+              <w:t xml:space="preserve">core/models.py</w:t>
+            </w:r>
+            <w:r>
+              <w:t xml:space="preserve"> </w:t>
+            </w:r>
+            <w:r>
+              <w:t xml:space="preserve">(BaseModel)</w:t>
+            </w:r>
+          </w:p>
+        </w:tc>
+        <w:tc>
+          <w:tcPr/>
+          <w:p>
+            <w:pPr>
+              <w:pStyle w:val="Compact"/>
+            </w:pPr>
+            <w:r>
+              <w:t xml:space="preserve">Métodos abstractos concreto/abstracto</w:t>
+            </w:r>
+          </w:p>
+        </w:tc>
+      </w:tr>
+      <w:tr>
+        <w:tc>
+          <w:tcPr/>
+          <w:p>
+            <w:pPr>
+              <w:pStyle w:val="Compact"/>
+            </w:pPr>
+            <w:r>
+              <w:rPr>
+                <w:b/>
+                <w:bCs/>
+              </w:rPr>
+              <w:t xml:space="preserve">ModelForm</w:t>
+            </w:r>
+          </w:p>
+        </w:tc>
+        <w:tc>
+          <w:tcPr/>
+          <w:p>
+            <w:pPr>
+              <w:pStyle w:val="Compact"/>
+            </w:pPr>
+            <w:r>
+              <w:rPr>
+                <w:rStyle w:val="VerbatimChar"/>
+              </w:rPr>
+              <w:t xml:space="preserve">website/forms.py</w:t>
+            </w:r>
+          </w:p>
+        </w:tc>
+        <w:tc>
+          <w:tcPr/>
+          <w:p>
+            <w:pPr>
+              <w:pStyle w:val="Compact"/>
+            </w:pPr>
+            <w:r>
+              <w:t xml:space="preserve">Generación automática de formularios desde modelos (DRY)</w:t>
+            </w:r>
+          </w:p>
+        </w:tc>
+      </w:tr>
+      <w:tr>
+        <w:tc>
+          <w:tcPr/>
+          <w:p>
+            <w:pPr>
+              <w:pStyle w:val="Compact"/>
+            </w:pPr>
+            <w:r>
+              <w:rPr>
+                <w:b/>
+                <w:bCs/>
+              </w:rPr>
+              <w:t xml:space="preserve">Observer</w:t>
+            </w:r>
+          </w:p>
+        </w:tc>
+        <w:tc>
+          <w:tcPr/>
+          <w:p>
+            <w:pPr>
+              <w:pStyle w:val="Compact"/>
+            </w:pPr>
+            <w:r>
+              <w:rPr>
+                <w:rStyle w:val="VerbatimChar"/>
+              </w:rPr>
+              <w:t xml:space="preserve">usuarios/signals.py</w:t>
+            </w:r>
+          </w:p>
+        </w:tc>
+        <w:tc>
+          <w:tcPr/>
+          <w:p>
+            <w:pPr>
+              <w:pStyle w:val="Compact"/>
+            </w:pPr>
+            <w:r>
+              <w:t xml:space="preserve">post_save signal para crear perfil al registrar usuario</w:t>
+            </w:r>
+          </w:p>
+        </w:tc>
+      </w:tr>
+      <w:tr>
+        <w:tc>
+          <w:tcPr/>
+          <w:p>
+            <w:pPr>
+              <w:pStyle w:val="Compact"/>
+            </w:pPr>
+            <w:r>
+              <w:rPr>
+                <w:b/>
+                <w:bCs/>
+              </w:rPr>
+              <w:t xml:space="preserve">Strategy</w:t>
+            </w:r>
+          </w:p>
+        </w:tc>
+        <w:tc>
+          <w:tcPr/>
+          <w:p>
+            <w:pPr>
+              <w:pStyle w:val="Compact"/>
+            </w:pPr>
+            <w:r>
+              <w:rPr>
+                <w:rStyle w:val="VerbatimChar"/>
+              </w:rPr>
+              <w:t xml:space="preserve">core/validators.py</w:t>
+            </w:r>
+          </w:p>
+        </w:tc>
+        <w:tc>
+          <w:tcPr/>
+          <w:p>
+            <w:pPr>
+              <w:pStyle w:val="Compact"/>
+            </w:pPr>
+            <w:r>
+              <w:t xml:space="preserve">Validación intercambiable vía RegexValidator y CustomValidator</w:t>
+            </w:r>
+          </w:p>
+        </w:tc>
+      </w:tr>
+    </w:tbl>
+    <w:bookmarkEnd w:id="23"/>
+    <w:bookmarkStart w:id="36" w:name="arquitectura-y-modelado"/>
+    <w:p>
+      <w:pPr>
+        <w:pStyle w:val="Heading2"/>
+      </w:pPr>
+      <w:r>
+        <w:t xml:space="preserve">Arquitectura y Modelado</w:t>
+      </w:r>
+    </w:p>
+    <w:p>
+      <w:pPr>
+        <w:pStyle w:val="FirstParagraph"/>
+      </w:pPr>
+      <w:r>
         <w:t xml:space="preserve">Ver</w:t>
       </w:r>
       <w:r>
@@ -631,7 +2355,7 @@
         <w:rPr>
           <w:rStyle w:val="VerbatimChar"/>
         </w:rPr>
-        <w:t xml:space="preserve">docs/modelos/</w:t>
+        <w:t xml:space="preserve">docs/</w:t>
       </w:r>
       <w:r>
         <w:t xml:space="preserve"> </w:t>
@@ -685,7 +2409,7 @@
             <w:pPr>
               <w:pStyle w:val="Compact"/>
             </w:pPr>
-            <w:hyperlink r:id="rId15">
+            <w:hyperlink r:id="rId24">
               <w:r>
                 <w:rPr>
                   <w:rStyle w:val="Hyperlink"/>
@@ -714,7 +2438,7 @@
             <w:pPr>
               <w:pStyle w:val="Compact"/>
             </w:pPr>
-            <w:hyperlink r:id="rId16">
+            <w:hyperlink r:id="rId25">
               <w:r>
                 <w:rPr>
                   <w:rStyle w:val="Hyperlink"/>
@@ -743,7 +2467,7 @@
             <w:pPr>
               <w:pStyle w:val="Compact"/>
             </w:pPr>
-            <w:hyperlink r:id="rId17">
+            <w:hyperlink r:id="rId26">
               <w:r>
                 <w:rPr>
                   <w:rStyle w:val="Hyperlink"/>
@@ -772,7 +2496,7 @@
             <w:pPr>
               <w:pStyle w:val="Compact"/>
             </w:pPr>
-            <w:hyperlink r:id="rId18">
+            <w:hyperlink r:id="rId27">
               <w:r>
                 <w:rPr>
                   <w:rStyle w:val="Hyperlink"/>
@@ -801,7 +2525,7 @@
             <w:pPr>
               <w:pStyle w:val="Compact"/>
             </w:pPr>
-            <w:hyperlink r:id="rId19">
+            <w:hyperlink r:id="rId28">
               <w:r>
                 <w:rPr>
                   <w:rStyle w:val="Hyperlink"/>
@@ -830,7 +2554,7 @@
             <w:pPr>
               <w:pStyle w:val="Compact"/>
             </w:pPr>
-            <w:hyperlink r:id="rId20">
+            <w:hyperlink r:id="rId29">
               <w:r>
                 <w:rPr>
                   <w:rStyle w:val="Hyperlink"/>
@@ -859,7 +2583,7 @@
             <w:pPr>
               <w:pStyle w:val="Compact"/>
             </w:pPr>
-            <w:hyperlink r:id="rId21">
+            <w:hyperlink r:id="rId30">
               <w:r>
                 <w:rPr>
                   <w:rStyle w:val="Hyperlink"/>
@@ -888,7 +2612,7 @@
             <w:pPr>
               <w:pStyle w:val="Compact"/>
             </w:pPr>
-            <w:hyperlink r:id="rId22">
+            <w:hyperlink r:id="rId31">
               <w:r>
                 <w:rPr>
                   <w:rStyle w:val="Hyperlink"/>
@@ -917,7 +2641,7 @@
             <w:pPr>
               <w:pStyle w:val="Compact"/>
             </w:pPr>
-            <w:hyperlink r:id="rId23">
+            <w:hyperlink r:id="rId32">
               <w:r>
                 <w:rPr>
                   <w:rStyle w:val="Hyperlink"/>
@@ -946,7 +2670,7 @@
             <w:pPr>
               <w:pStyle w:val="Compact"/>
             </w:pPr>
-            <w:hyperlink r:id="rId24">
+            <w:hyperlink r:id="rId33">
               <w:r>
                 <w:rPr>
                   <w:rStyle w:val="Hyperlink"/>
@@ -975,7 +2699,7 @@
             <w:pPr>
               <w:pStyle w:val="Compact"/>
             </w:pPr>
-            <w:hyperlink r:id="rId25">
+            <w:hyperlink r:id="rId34">
               <w:r>
                 <w:rPr>
                   <w:rStyle w:val="Hyperlink"/>
@@ -1004,7 +2728,7 @@
             <w:pPr>
               <w:pStyle w:val="Compact"/>
             </w:pPr>
-            <w:hyperlink r:id="rId26">
+            <w:hyperlink r:id="rId35">
               <w:r>
                 <w:rPr>
                   <w:rStyle w:val="Hyperlink"/>
@@ -1021,20 +2745,20 @@
               <w:pStyle w:val="Compact"/>
             </w:pPr>
             <w:r>
-              <w:t xml:space="preserve">6 patrones documentados</w:t>
+              <w:t xml:space="preserve">30 patrones documentados</w:t>
             </w:r>
           </w:p>
         </w:tc>
       </w:tr>
     </w:tbl>
-    <w:bookmarkEnd w:id="27"/>
-    <w:bookmarkStart w:id="28" w:name="estructura"/>
+    <w:bookmarkEnd w:id="36"/>
+    <w:bookmarkStart w:id="37" w:name="estructura-del-proyecto"/>
     <w:p>
       <w:pPr>
         <w:pStyle w:val="Heading2"/>
       </w:pPr>
       <w:r>
-        <w:t xml:space="preserve">Estructura</w:t>
+        <w:t xml:space="preserve">Estructura del Proyecto</w:t>
       </w:r>
     </w:p>
     <w:p>
@@ -1045,7 +2769,7 @@
         <w:rPr>
           <w:rStyle w:val="VerbatimChar"/>
         </w:rPr>
-        <w:t xml:space="preserve">dcrm/</w:t>
+        <w:t xml:space="preserve">ProyectoDJviernes/</w:t>
       </w:r>
       <w:r>
         <w:br/>
@@ -1054,7 +2778,7 @@
         <w:rPr>
           <w:rStyle w:val="VerbatimChar"/>
         </w:rPr>
-        <w:t xml:space="preserve">├── core/          # Capa base POO (modelos, servicios, repositorios)</w:t>
+        <w:t xml:space="preserve">├── dcrm/</w:t>
       </w:r>
       <w:r>
         <w:br/>
@@ -1063,7 +2787,7 @@
         <w:rPr>
           <w:rStyle w:val="VerbatimChar"/>
         </w:rPr>
-        <w:t xml:space="preserve">├── website/       # CRUD clientes</w:t>
+        <w:t xml:space="preserve">│   ├── core/              # Capa base POO (modelos, servicios, repositorios)</w:t>
       </w:r>
       <w:r>
         <w:br/>
@@ -1072,7 +2796,7 @@
         <w:rPr>
           <w:rStyle w:val="VerbatimChar"/>
         </w:rPr>
-        <w:t xml:space="preserve">├── usuarios/      # Gestión de usuarios y roles</w:t>
+        <w:t xml:space="preserve">│   ├── website/           # CRUD clientes, seed data, templates</w:t>
       </w:r>
       <w:r>
         <w:br/>
@@ -1081,7 +2805,7 @@
         <w:rPr>
           <w:rStyle w:val="VerbatimChar"/>
         </w:rPr>
-        <w:t xml:space="preserve">├── productos/     # CRUD productos</w:t>
+        <w:t xml:space="preserve">│   ├── usuarios/          # Gestión de usuarios y roles</w:t>
       </w:r>
       <w:r>
         <w:br/>
@@ -1090,7 +2814,7 @@
         <w:rPr>
           <w:rStyle w:val="VerbatimChar"/>
         </w:rPr>
-        <w:t xml:space="preserve">├── catalogo/      # Catálogos y categorías</w:t>
+        <w:t xml:space="preserve">│   ├── productos/         # CRUD productos</w:t>
       </w:r>
       <w:r>
         <w:br/>
@@ -1099,11 +2823,119 @@
         <w:rPr>
           <w:rStyle w:val="VerbatimChar"/>
         </w:rPr>
-        <w:t xml:space="preserve">└── dcrm/          # Configuración del proyecto</w:t>
-      </w:r>
-    </w:p>
-    <w:bookmarkEnd w:id="28"/>
-    <w:bookmarkEnd w:id="29"/>
+        <w:t xml:space="preserve">│   ├── catalogo/          # Catálogos y categorías</w:t>
+      </w:r>
+      <w:r>
+        <w:br/>
+      </w:r>
+      <w:r>
+        <w:rPr>
+          <w:rStyle w:val="VerbatimChar"/>
+        </w:rPr>
+        <w:t xml:space="preserve">│   └── dcrm/              # Configuración del proyecto</w:t>
+      </w:r>
+      <w:r>
+        <w:br/>
+      </w:r>
+      <w:r>
+        <w:rPr>
+          <w:rStyle w:val="VerbatimChar"/>
+        </w:rPr>
+        <w:t xml:space="preserve">├── Dockerfile             # Construcción de imagen Docker</w:t>
+      </w:r>
+      <w:r>
+        <w:br/>
+      </w:r>
+      <w:r>
+        <w:rPr>
+          <w:rStyle w:val="VerbatimChar"/>
+        </w:rPr>
+        <w:t xml:space="preserve">├── docker-compose.yml     # Orquestación de contenedores</w:t>
+      </w:r>
+      <w:r>
+        <w:br/>
+      </w:r>
+      <w:r>
+        <w:rPr>
+          <w:rStyle w:val="VerbatimChar"/>
+        </w:rPr>
+        <w:t xml:space="preserve">├── docker-entrypoint.sh   # Script de inicio (migraciones + seed)</w:t>
+      </w:r>
+      <w:r>
+        <w:br/>
+      </w:r>
+      <w:r>
+        <w:rPr>
+          <w:rStyle w:val="VerbatimChar"/>
+        </w:rPr>
+        <w:t xml:space="preserve">├── requirements.txt       # Dependencias de desarrollo</w:t>
+      </w:r>
+      <w:r>
+        <w:br/>
+      </w:r>
+      <w:r>
+        <w:rPr>
+          <w:rStyle w:val="VerbatimChar"/>
+        </w:rPr>
+        <w:t xml:space="preserve">├── requirements.prod.txt  # Dependencias de producción</w:t>
+      </w:r>
+      <w:r>
+        <w:br/>
+      </w:r>
+      <w:r>
+        <w:rPr>
+          <w:rStyle w:val="VerbatimChar"/>
+        </w:rPr>
+        <w:t xml:space="preserve">└── README.md</w:t>
+      </w:r>
+    </w:p>
+    <w:bookmarkEnd w:id="37"/>
+    <w:bookmarkStart w:id="38" w:name="requisitos-1"/>
+    <w:p>
+      <w:pPr>
+        <w:pStyle w:val="Heading2"/>
+      </w:pPr>
+      <w:r>
+        <w:t xml:space="preserve">Requisitos</w:t>
+      </w:r>
+    </w:p>
+    <w:p>
+      <w:pPr>
+        <w:pStyle w:val="FirstParagraph"/>
+      </w:pPr>
+      <w:r>
+        <w:t xml:space="preserve">Ver</w:t>
+      </w:r>
+      <w:r>
+        <w:t xml:space="preserve"> </w:t>
+      </w:r>
+      <w:r>
+        <w:rPr>
+          <w:rStyle w:val="VerbatimChar"/>
+        </w:rPr>
+        <w:t xml:space="preserve">requirements.txt</w:t>
+      </w:r>
+      <w:r>
+        <w:t xml:space="preserve"> </w:t>
+      </w:r>
+      <w:r>
+        <w:t xml:space="preserve">y</w:t>
+      </w:r>
+      <w:r>
+        <w:t xml:space="preserve"> </w:t>
+      </w:r>
+      <w:r>
+        <w:rPr>
+          <w:rStyle w:val="VerbatimChar"/>
+        </w:rPr>
+        <w:t xml:space="preserve">requirements.prod.txt</w:t>
+      </w:r>
+      <w:r>
+        <w:t xml:space="preserve">.</w:t>
+      </w:r>
+    </w:p>
+    <w:bookmarkEnd w:id="38"/>
+    <w:bookmarkEnd w:id="39"/>
     <w:sectPr>
       <w:footnotePr>
         <w:numRestart w:val="eachSect"/>
@@ -1409,6 +3241,15 @@
     <w:abstractNumId w:val="991"/>
   </w:num>
   <w:num w:numId="1002">
+    <w:abstractNumId w:val="991"/>
+  </w:num>
+  <w:num w:numId="1003">
+    <w:abstractNumId w:val="991"/>
+  </w:num>
+  <w:num w:numId="1004">
+    <w:abstractNumId w:val="991"/>
+  </w:num>
+  <w:num w:numId="1005">
     <w:abstractNumId w:val="99411"/>
     <w:lvlOverride w:ilvl="0">
       <w:startOverride w:val="1"/>
@@ -1437,9 +3278,6 @@
     <w:lvlOverride w:ilvl="8">
       <w:startOverride w:val="1"/>
     </w:lvlOverride>
-  </w:num>
-  <w:num w:numId="1003">
-    <w:abstractNumId w:val="991"/>
   </w:num>
 </w:numbering>
 </file>

</xml_diff>